<commit_message>
feat(chat): make chat resilient to long-running LLM calls and refresh
Commit user message + release the txn before invoking the LLM so a
slow/failed tool call no longer poisons the SQLAlchemy session with
PendingRollbackError. Chat store now polls and recovers when a page
refresh leaves a user turn without an assistant reply, surfacing a
retry affordance after 90s of silence. Regenerate template artifacts.

Co-Authored-By: Claude Opus 4.7 <noreply@anthropic.com>
</commit_message>
<xml_diff>
--- a/backend/tests/artifacts/templates/batch_record_blank_roles.docx
+++ b/backend/tests/artifacts/templates/batch_record_blank_roles.docx
@@ -878,6 +878,11 @@
         <w:t>Signature / Date</w:t>
       </w:r>
     </w:p>
+    <w:p>
+      <w:r>
+        <w:t/>
+      </w:r>
+    </w:p>
     <w:sectPr>
       <w:headerReference w:type="default" r:id="rId9"/>
       <w:footerReference w:type="default" r:id="rId10"/>

</xml_diff>

<commit_message>
fix(templates): use raw half-points in RichText.add size= calls
docxtpl RichText.add(size=…) writes the value directly into Word's
w:sz attribute (half-points: 20 = 10pt). docx.shared.Pt() returns
EMU instead, so size=Pt(10) emitted sz="127000" and Word treated
runs as ~63500pt — the P1 SOP rendered as 225 pages.

Switched every RichText.add(size=…) site to raw half-points:
  Pt(6) → 12, Pt(8) → 16, Pt(10) → 20, Pt(14) → 28.

Pt() stays correct for paragraph-style and section settings that
take EMU; RichText.add is the one path that wants the wire value.

QA-0008.

Co-Authored-By: Claude Opus 4.7 <noreply@anthropic.com>
</commit_message>
<xml_diff>
--- a/backend/tests/artifacts/templates/batch_record_blank_roles.docx
+++ b/backend/tests/artifacts/templates/batch_record_blank_roles.docx
@@ -3,277 +3,233 @@
 <w:document xmlns:wpc="http://schemas.microsoft.com/office/word/2010/wordprocessingCanvas" xmlns:mo="http://schemas.microsoft.com/office/mac/office/2008/main" xmlns:mc="http://schemas.openxmlformats.org/markup-compatibility/2006" xmlns:mv="urn:schemas-microsoft-com:mac:vml" xmlns:o="urn:schemas-microsoft-com:office:office" xmlns:r="http://schemas.openxmlformats.org/officeDocument/2006/relationships" xmlns:m="http://schemas.openxmlformats.org/officeDocument/2006/math" xmlns:v="urn:schemas-microsoft-com:vml" xmlns:wp14="http://schemas.microsoft.com/office/word/2010/wordprocessingDrawing" xmlns:wp="http://schemas.openxmlformats.org/drawingml/2006/wordprocessingDrawing" xmlns:w10="urn:schemas-microsoft-com:office:word" xmlns:w="http://schemas.openxmlformats.org/wordprocessingml/2006/main" xmlns:w14="http://schemas.microsoft.com/office/word/2010/wordml" xmlns:wpg="http://schemas.microsoft.com/office/word/2010/wordprocessingGroup" xmlns:wpi="http://schemas.microsoft.com/office/word/2010/wordprocessingInk" xmlns:wne="http://schemas.microsoft.com/office/word/2006/wordml" xmlns:wps="http://schemas.microsoft.com/office/word/2010/wordprocessingShape" mc:Ignorable="w14 wp14">
   <w:body>
     <w:p>
-      <w:pPr>
-        <w:spacing w:after="240"/>
-      </w:pPr>
       <w:r>
         <w:rPr>
           <w:b/>
-          <w:color w:val="334155"/>
-          <w:sz w:val="20"/>
+          <w:sz w:val="36"/>
         </w:rPr>
-        <w:t xml:space="preserve">Date: </w:t>
+        <w:t xml:space="preserve">Multi-Role Buffer Protocol — Batch Record</w:t>
+      </w:r>
+    </w:p>
+    <w:p>
+      <w:r>
+        <w:rPr>
+          <w:b w:val="0"/>
+          <w:sz w:val="22"/>
+        </w:rPr>
+        <w:t xml:space="preserve"/>
+      </w:r>
+    </w:p>
+    <w:p>
+      <w:r>
+        <w:rPr>
+          <w:b w:val="0"/>
+          <w:sz w:val="22"/>
+        </w:rPr>
+        <w:t xml:space="preserve"/>
+      </w:r>
+    </w:p>
+    <w:p>
+      <w:r>
+        <w:rPr>
+          <w:b w:val="0"/>
+          <w:sz w:val="22"/>
+        </w:rPr>
+        <w:t xml:space="preserve">Run: Preview  |  Status: </w:t>
+      </w:r>
+    </w:p>
+    <w:p>
+      <w:r>
+        <w:rPr>
+          <w:b w:val="0"/>
+          <w:sz w:val="22"/>
+        </w:rPr>
+        <w:t xml:space="preserve">Started:   |  Completed: </w:t>
+      </w:r>
+    </w:p>
+    <w:p>
+      <w:r>
+        <w:rPr>
+          <w:b w:val="0"/>
+          <w:sz w:val="22"/>
+        </w:rPr>
+        <w:t xml:space="preserve">Project:   |  Organization: </w:t>
+      </w:r>
+    </w:p>
+    <w:p>
+      <w:r>
+        <w:rPr>
+          <w:b w:val="0"/>
+          <w:sz w:val="22"/>
+        </w:rPr>
+        <w:t xml:space="preserve">SOP Reference:  v2 (effective )</w:t>
+      </w:r>
+    </w:p>
+    <w:p>
+      <w:r>
+        <w:rPr>
+          <w:b/>
+          <w:sz w:val="28"/>
+        </w:rPr>
+        <w:t>Procedure Execution</w:t>
+      </w:r>
+    </w:p>
+    <w:p>
+      <w:r>
+        <w:rPr>
+          <w:b w:val="0"/>
+          <w:sz w:val="22"/>
+        </w:rPr>
+        <w:t xml:space="preserve"/>
       </w:r>
       <w:r>
         <w:rPr>
-          <w:color w:val="787878"/>
-          <w:sz w:val="20"/>
+          <w:sz w:val="177800"/>
+          <w:szCs w:val="177800"/>
+          <w:b/>
         </w:rPr>
-        <w:t>_______________</w:t>
-        <w:tab/>
-        <w:tab/>
+        <w:t xml:space="preserve">Media Prep</w:t>
       </w:r>
       <w:r>
-        <w:rPr>
-          <w:b/>
-          <w:color w:val="334155"/>
-          <w:sz w:val="20"/>
-        </w:rPr>
-        <w:t xml:space="preserve">Lot/Batch #: </w:t>
-      </w:r>
-      <w:r>
-        <w:rPr>
-          <w:color w:val="787878"/>
-          <w:sz w:val="20"/>
-        </w:rPr>
-        <w:t>_______________</w:t>
-      </w:r>
-    </w:p>
-    <w:p>
-      <w:pPr>
-        <w:spacing w:after="120" w:before="0"/>
-      </w:pPr>
-      <w:r>
-        <w:rPr>
-          <w:b/>
-          <w:color w:val="0F172A"/>
-          <w:sz w:val="28"/>
-        </w:rPr>
-        <w:t xml:space="preserve">Media Prep</w:t>
+        <w:t xml:space="preserve"/>
       </w:r>
     </w:p>
     <w:tbl>
       <w:tblPr>
-        <w:tblStyle w:val="TableGrid"/>
+        <w:tblStyle w:val="LightGrid-Accent1"/>
         <w:tblW w:type="auto" w:w="0"/>
         <w:tblLook w:firstColumn="1" w:firstRow="1" w:lastColumn="0" w:lastRow="0" w:noHBand="0" w:noVBand="1" w:val="04A0"/>
-        <w:tblCellMar>
-          <w:top w:w="56" w:type="dxa"/>
-          <w:bottom w:w="56" w:type="dxa"/>
-          <w:start w:w="56" w:type="dxa"/>
-          <w:end w:w="56" w:type="dxa"/>
-        </w:tblCellMar>
-        <w:tblLayout w:type="fixed"/>
       </w:tblPr>
       <w:tblGrid>
-        <w:gridCol w:w="504"/>
-        <w:gridCol w:w="2016"/>
-        <w:gridCol w:w="4032"/>
-        <w:gridCol w:w="2016"/>
-        <w:gridCol w:w="1512"/>
+        <w:gridCol w:w="1108"/>
+        <w:gridCol w:w="1108"/>
+        <w:gridCol w:w="1108"/>
+        <w:gridCol w:w="1108"/>
+        <w:gridCol w:w="1108"/>
+        <w:gridCol w:w="1108"/>
+        <w:gridCol w:w="1108"/>
+        <w:gridCol w:w="1108"/>
+        <w:gridCol w:w="1108"/>
       </w:tblGrid>
       <w:tr>
-        <w:trPr>
-          <w:trHeight w:val="454" w:hRule="atLeast"/>
-        </w:trPr>
         <w:tc>
           <w:tcPr>
-            <w:tcW w:type="dxa" w:w="504"/>
-            <w:shd w:val="clear" w:color="auto" w:fill="1E293B"/>
+            <w:tcW w:type="dxa" w:w="1108"/>
           </w:tcPr>
           <w:p>
-            <w:pPr>
-              <w:spacing w:before="0" w:after="0"/>
-              <w:jc w:val="center"/>
-            </w:pPr>
-            <w:r/>
             <w:r>
-              <w:rPr>
-                <w:b/>
-                <w:color w:val="FFFFFF"/>
-                <w:sz w:val="16"/>
-              </w:rPr>
-              <w:t>#</w:t>
-            </w:r>
-          </w:p>
-        </w:tc>
-        <w:tc>
-          <w:tcPr>
-            <w:tcW w:type="dxa" w:w="2016"/>
-            <w:shd w:val="clear" w:color="auto" w:fill="1E293B"/>
-          </w:tcPr>
-          <w:p>
-            <w:pPr>
-              <w:spacing w:before="0" w:after="0"/>
-              <w:jc w:val="center"/>
-            </w:pPr>
-            <w:r/>
-            <w:r>
-              <w:rPr>
-                <w:b/>
-                <w:color w:val="FFFFFF"/>
-                <w:sz w:val="16"/>
-              </w:rPr>
               <w:t>Step</w:t>
             </w:r>
           </w:p>
         </w:tc>
         <w:tc>
           <w:tcPr>
-            <w:tcW w:type="dxa" w:w="4032"/>
-            <w:shd w:val="clear" w:color="auto" w:fill="1E293B"/>
+            <w:tcW w:type="dxa" w:w="1108"/>
           </w:tcPr>
           <w:p>
-            <w:pPr>
-              <w:spacing w:before="0" w:after="0"/>
-              <w:jc w:val="center"/>
-            </w:pPr>
-            <w:r/>
             <w:r>
-              <w:rPr>
-                <w:b/>
-                <w:color w:val="FFFFFF"/>
-                <w:sz w:val="16"/>
-              </w:rPr>
               <w:t>Description</w:t>
             </w:r>
           </w:p>
         </w:tc>
         <w:tc>
           <w:tcPr>
-            <w:tcW w:type="dxa" w:w="2016"/>
-            <w:shd w:val="clear" w:color="auto" w:fill="1E293B"/>
+            <w:tcW w:type="dxa" w:w="1108"/>
           </w:tcPr>
           <w:p>
-            <w:pPr>
-              <w:spacing w:before="0" w:after="0"/>
-              <w:jc w:val="center"/>
-            </w:pPr>
-            <w:r/>
             <w:r>
-              <w:rPr>
-                <w:b/>
-                <w:color w:val="FFFFFF"/>
-                <w:sz w:val="16"/>
-              </w:rPr>
-              <w:t>Value / Result</w:t>
+              <w:t>Value</w:t>
             </w:r>
           </w:p>
         </w:tc>
         <w:tc>
           <w:tcPr>
-            <w:tcW w:type="dxa" w:w="1512"/>
-            <w:shd w:val="clear" w:color="auto" w:fill="1E293B"/>
+            <w:tcW w:type="dxa" w:w="1108"/>
           </w:tcPr>
           <w:p>
-            <w:pPr>
-              <w:spacing w:before="0" w:after="0"/>
-              <w:jc w:val="center"/>
-            </w:pPr>
-            <w:r/>
             <w:r>
-              <w:rPr>
-                <w:b/>
-                <w:color w:val="FFFFFF"/>
-                <w:sz w:val="16"/>
-              </w:rPr>
-              <w:t>Initials</w:t>
+              <w:t>Operator</w:t>
+            </w:r>
+          </w:p>
+        </w:tc>
+        <w:tc>
+          <w:tcPr>
+            <w:tcW w:type="dxa" w:w="1108"/>
+          </w:tcPr>
+          <w:p>
+            <w:r>
+              <w:t>Reviewer</w:t>
+            </w:r>
+          </w:p>
+        </w:tc>
+        <w:tc>
+          <w:tcPr>
+            <w:tcW w:type="dxa" w:w="1108"/>
+          </w:tcPr>
+          <w:p>
+            <w:r>
+              <w:t>Scheduled</w:t>
+            </w:r>
+          </w:p>
+        </w:tc>
+        <w:tc>
+          <w:tcPr>
+            <w:tcW w:type="dxa" w:w="1108"/>
+          </w:tcPr>
+          <w:p>
+            <w:r>
+              <w:t>Actual Start</w:t>
+            </w:r>
+          </w:p>
+        </w:tc>
+        <w:tc>
+          <w:tcPr>
+            <w:tcW w:type="dxa" w:w="1108"/>
+          </w:tcPr>
+          <w:p>
+            <w:r>
+              <w:t>Actual End</w:t>
+            </w:r>
+          </w:p>
+        </w:tc>
+        <w:tc>
+          <w:tcPr>
+            <w:tcW w:type="dxa" w:w="1108"/>
+          </w:tcPr>
+          <w:p>
+            <w:r>
+              <w:t>Notes</w:t>
             </w:r>
           </w:p>
         </w:tc>
       </w:tr>
       <w:tr>
-        <w:trPr>
-          <w:trHeight w:val="680" w:hRule="atLeast"/>
-        </w:trPr>
         <w:tc>
           <w:tcPr>
-            <w:tcW w:type="dxa" w:w="504"/>
+            <w:tcW w:type="dxa" w:w="1108"/>
           </w:tcPr>
           <w:p>
-            <w:pPr>
-              <w:spacing w:before="0" w:after="0"/>
-            </w:pPr>
-            <w:r/>
             <w:r>
-              <w:rPr>
-                <w:color w:val="334155"/>
-                <w:sz w:val="16"/>
-              </w:rPr>
-              <w:t xml:space="preserve">1</w:t>
-            </w:r>
-          </w:p>
-        </w:tc>
-        <w:tc>
-          <w:tcPr>
-            <w:tcW w:type="dxa" w:w="2016"/>
-          </w:tcPr>
-          <w:p>
-            <w:pPr>
-              <w:spacing w:before="0" w:after="0"/>
-            </w:pPr>
-            <w:r/>
-            <w:r>
-              <w:rPr>
-                <w:color w:val="334155"/>
-                <w:sz w:val="16"/>
-              </w:rPr>
               <w:t xml:space="preserve">Weigh Reagents</w:t>
             </w:r>
           </w:p>
         </w:tc>
         <w:tc>
           <w:tcPr>
-            <w:tcW w:type="dxa" w:w="4032"/>
+            <w:tcW w:type="dxa" w:w="1108"/>
           </w:tcPr>
           <w:p>
-            <w:pPr>
-              <w:spacing w:before="0" w:after="80"/>
-            </w:pPr>
-            <w:r/>
             <w:r>
-              <w:rPr>
-                <w:color w:val="334155"/>
-                <w:sz w:val="16"/>
-              </w:rPr>
               <w:t xml:space="preserve">Weigh NaCl and KCl. NaCl: 8, and KCl: 0.2.</w:t>
-            </w:r>
-          </w:p>
-          <w:p>
-            <w:pPr>
-              <w:spacing w:before="40" w:after="0"/>
-            </w:pPr>
-            <w:r>
-              <w:rPr>
-                <w:i/>
-                <w:color w:val="969BA5"/>
-                <w:sz w:val="14"/>
-              </w:rPr>
-              <w:t xml:space="preserve">Notes: </w:t>
-            </w:r>
-            <w:r>
-              <w:rPr>
-                <w:color w:val="334155"/>
-                <w:sz w:val="14"/>
-              </w:rPr>
-              <w:t xml:space="preserve"/>
             </w:r>
           </w:p>
         </w:tc>
         <w:tc>
           <w:tcPr>
-            <w:tcW w:type="dxa" w:w="2016"/>
+            <w:tcW w:type="dxa" w:w="1108"/>
           </w:tcPr>
           <w:p>
-            <w:pPr>
-              <w:spacing w:before="0" w:after="0"/>
-            </w:pPr>
-            <w:r/>
             <w:r>
-              <w:rPr>
-                <w:color w:val="334155"/>
-                <w:sz w:val="16"/>
-              </w:rPr>
               <w:t xml:space="preserve"/>
             </w:r>
             <w:r>
@@ -296,9 +252,6 @@
             </w:r>
           </w:p>
           <w:p>
-            <w:pPr>
-              <w:spacing w:before="0" w:after="0"/>
-            </w:pPr>
             <w:r>
               <w:t xml:space="preserve"/>
             </w:r>
@@ -324,115 +277,92 @@
         </w:tc>
         <w:tc>
           <w:tcPr>
-            <w:tcW w:type="dxa" w:w="1512"/>
+            <w:tcW w:type="dxa" w:w="1108"/>
           </w:tcPr>
           <w:p>
-            <w:pPr>
-              <w:spacing w:before="0" w:after="0"/>
-            </w:pPr>
-            <w:r/>
             <w:r>
-              <w:rPr>
-                <w:color w:val="334155"/>
-                <w:sz w:val="16"/>
-              </w:rPr>
+              <w:t xml:space="preserve"/>
+            </w:r>
+          </w:p>
+        </w:tc>
+        <w:tc>
+          <w:tcPr>
+            <w:tcW w:type="dxa" w:w="1108"/>
+          </w:tcPr>
+          <w:p>
+            <w:r>
+              <w:t xml:space="preserve"/>
+            </w:r>
+          </w:p>
+        </w:tc>
+        <w:tc>
+          <w:tcPr>
+            <w:tcW w:type="dxa" w:w="1108"/>
+          </w:tcPr>
+          <w:p>
+            <w:r>
+              <w:t xml:space="preserve"/>
+            </w:r>
+          </w:p>
+        </w:tc>
+        <w:tc>
+          <w:tcPr>
+            <w:tcW w:type="dxa" w:w="1108"/>
+          </w:tcPr>
+          <w:p>
+            <w:r>
+              <w:t xml:space="preserve"/>
+            </w:r>
+          </w:p>
+        </w:tc>
+        <w:tc>
+          <w:tcPr>
+            <w:tcW w:type="dxa" w:w="1108"/>
+          </w:tcPr>
+          <w:p>
+            <w:r>
+              <w:t xml:space="preserve"/>
+            </w:r>
+          </w:p>
+        </w:tc>
+        <w:tc>
+          <w:tcPr>
+            <w:tcW w:type="dxa" w:w="1108"/>
+          </w:tcPr>
+          <w:p>
+            <w:r>
               <w:t xml:space="preserve"/>
             </w:r>
           </w:p>
         </w:tc>
       </w:tr>
       <w:tr>
-        <w:trPr>
-          <w:trHeight w:val="680" w:hRule="atLeast"/>
-        </w:trPr>
         <w:tc>
           <w:tcPr>
-            <w:tcW w:type="dxa" w:w="504"/>
+            <w:tcW w:type="dxa" w:w="1108"/>
           </w:tcPr>
           <w:p>
-            <w:pPr>
-              <w:spacing w:before="0" w:after="0"/>
-            </w:pPr>
-            <w:r/>
             <w:r>
-              <w:rPr>
-                <w:color w:val="334155"/>
-                <w:sz w:val="16"/>
-              </w:rPr>
-              <w:t xml:space="preserve">2</w:t>
-            </w:r>
-          </w:p>
-        </w:tc>
-        <w:tc>
-          <w:tcPr>
-            <w:tcW w:type="dxa" w:w="2016"/>
-          </w:tcPr>
-          <w:p>
-            <w:pPr>
-              <w:spacing w:before="0" w:after="0"/>
-            </w:pPr>
-            <w:r/>
-            <w:r>
-              <w:rPr>
-                <w:color w:val="334155"/>
-                <w:sz w:val="16"/>
-              </w:rPr>
               <w:t xml:space="preserve">Dissolve</w:t>
             </w:r>
           </w:p>
         </w:tc>
         <w:tc>
           <w:tcPr>
-            <w:tcW w:type="dxa" w:w="4032"/>
+            <w:tcW w:type="dxa" w:w="1108"/>
           </w:tcPr>
           <w:p>
-            <w:pPr>
-              <w:spacing w:before="0" w:after="80"/>
-            </w:pPr>
-            <w:r/>
             <w:r>
-              <w:rPr>
-                <w:color w:val="334155"/>
-                <w:sz w:val="16"/>
-              </w:rPr>
               <w:t xml:space="preserve">Add to 1000 mL water and stir.</w:t>
-            </w:r>
-          </w:p>
-          <w:p>
-            <w:pPr>
-              <w:spacing w:before="40" w:after="0"/>
-            </w:pPr>
-            <w:r>
-              <w:rPr>
-                <w:i/>
-                <w:color w:val="969BA5"/>
-                <w:sz w:val="14"/>
-              </w:rPr>
-              <w:t xml:space="preserve">Notes: </w:t>
-            </w:r>
-            <w:r>
-              <w:rPr>
-                <w:color w:val="334155"/>
-                <w:sz w:val="14"/>
-              </w:rPr>
-              <w:t xml:space="preserve"/>
             </w:r>
           </w:p>
         </w:tc>
         <w:tc>
           <w:tcPr>
-            <w:tcW w:type="dxa" w:w="2016"/>
+            <w:tcW w:type="dxa" w:w="1108"/>
           </w:tcPr>
           <w:p>
-            <w:pPr>
-              <w:spacing w:before="0" w:after="0"/>
-            </w:pPr>
-            <w:r/>
             <w:r>
-              <w:rPr>
-                <w:color w:val="334155"/>
-                <w:sz w:val="16"/>
-              </w:rPr>
               <w:t xml:space="preserve"/>
             </w:r>
             <w:r>
@@ -442,18 +372,60 @@
         </w:tc>
         <w:tc>
           <w:tcPr>
-            <w:tcW w:type="dxa" w:w="1512"/>
+            <w:tcW w:type="dxa" w:w="1108"/>
           </w:tcPr>
           <w:p>
-            <w:pPr>
-              <w:spacing w:before="0" w:after="0"/>
-            </w:pPr>
-            <w:r/>
             <w:r>
-              <w:rPr>
-                <w:color w:val="334155"/>
-                <w:sz w:val="16"/>
-              </w:rPr>
+              <w:t xml:space="preserve"/>
+            </w:r>
+          </w:p>
+        </w:tc>
+        <w:tc>
+          <w:tcPr>
+            <w:tcW w:type="dxa" w:w="1108"/>
+          </w:tcPr>
+          <w:p>
+            <w:r>
+              <w:t xml:space="preserve"/>
+            </w:r>
+          </w:p>
+        </w:tc>
+        <w:tc>
+          <w:tcPr>
+            <w:tcW w:type="dxa" w:w="1108"/>
+          </w:tcPr>
+          <w:p>
+            <w:r>
+              <w:t xml:space="preserve"/>
+            </w:r>
+          </w:p>
+        </w:tc>
+        <w:tc>
+          <w:tcPr>
+            <w:tcW w:type="dxa" w:w="1108"/>
+          </w:tcPr>
+          <w:p>
+            <w:r>
+              <w:t xml:space="preserve"/>
+            </w:r>
+          </w:p>
+        </w:tc>
+        <w:tc>
+          <w:tcPr>
+            <w:tcW w:type="dxa" w:w="1108"/>
+          </w:tcPr>
+          <w:p>
+            <w:r>
+              <w:t xml:space="preserve"/>
+            </w:r>
+          </w:p>
+        </w:tc>
+        <w:tc>
+          <w:tcPr>
+            <w:tcW w:type="dxa" w:w="1108"/>
+          </w:tcPr>
+          <w:p>
+            <w:r>
               <w:t xml:space="preserve"/>
             </w:r>
           </w:p>
@@ -461,275 +433,10 @@
       </w:tr>
     </w:tbl>
     <w:p>
-      <w:pPr>
-        <w:spacing w:after="120" w:before="0"/>
-      </w:pPr>
       <w:r>
         <w:rPr>
-          <w:b/>
-          <w:color w:val="0F172A"/>
-          <w:sz w:val="28"/>
-        </w:rPr>
-        <w:t xml:space="preserve">QC</w:t>
-      </w:r>
-    </w:p>
-    <w:tbl>
-      <w:tblPr>
-        <w:tblStyle w:val="TableGrid"/>
-        <w:tblW w:type="auto" w:w="0"/>
-        <w:tblLook w:firstColumn="1" w:firstRow="1" w:lastColumn="0" w:lastRow="0" w:noHBand="0" w:noVBand="1" w:val="04A0"/>
-        <w:tblCellMar>
-          <w:top w:w="56" w:type="dxa"/>
-          <w:bottom w:w="56" w:type="dxa"/>
-          <w:start w:w="56" w:type="dxa"/>
-          <w:end w:w="56" w:type="dxa"/>
-        </w:tblCellMar>
-        <w:tblLayout w:type="fixed"/>
-      </w:tblPr>
-      <w:tblGrid>
-        <w:gridCol w:w="504"/>
-        <w:gridCol w:w="2016"/>
-        <w:gridCol w:w="4032"/>
-        <w:gridCol w:w="2016"/>
-        <w:gridCol w:w="1512"/>
-      </w:tblGrid>
-      <w:tr>
-        <w:trPr>
-          <w:trHeight w:val="454" w:hRule="atLeast"/>
-        </w:trPr>
-        <w:tc>
-          <w:tcPr>
-            <w:tcW w:type="dxa" w:w="504"/>
-            <w:shd w:val="clear" w:color="auto" w:fill="1E293B"/>
-          </w:tcPr>
-          <w:p>
-            <w:pPr>
-              <w:spacing w:before="0" w:after="0"/>
-              <w:jc w:val="center"/>
-            </w:pPr>
-            <w:r/>
-            <w:r>
-              <w:rPr>
-                <w:b/>
-                <w:color w:val="FFFFFF"/>
-                <w:sz w:val="16"/>
-              </w:rPr>
-              <w:t>#</w:t>
-            </w:r>
-          </w:p>
-        </w:tc>
-        <w:tc>
-          <w:tcPr>
-            <w:tcW w:type="dxa" w:w="2016"/>
-            <w:shd w:val="clear" w:color="auto" w:fill="1E293B"/>
-          </w:tcPr>
-          <w:p>
-            <w:pPr>
-              <w:spacing w:before="0" w:after="0"/>
-              <w:jc w:val="center"/>
-            </w:pPr>
-            <w:r/>
-            <w:r>
-              <w:rPr>
-                <w:b/>
-                <w:color w:val="FFFFFF"/>
-                <w:sz w:val="16"/>
-              </w:rPr>
-              <w:t>Step</w:t>
-            </w:r>
-          </w:p>
-        </w:tc>
-        <w:tc>
-          <w:tcPr>
-            <w:tcW w:type="dxa" w:w="4032"/>
-            <w:shd w:val="clear" w:color="auto" w:fill="1E293B"/>
-          </w:tcPr>
-          <w:p>
-            <w:pPr>
-              <w:spacing w:before="0" w:after="0"/>
-              <w:jc w:val="center"/>
-            </w:pPr>
-            <w:r/>
-            <w:r>
-              <w:rPr>
-                <w:b/>
-                <w:color w:val="FFFFFF"/>
-                <w:sz w:val="16"/>
-              </w:rPr>
-              <w:t>Description</w:t>
-            </w:r>
-          </w:p>
-        </w:tc>
-        <w:tc>
-          <w:tcPr>
-            <w:tcW w:type="dxa" w:w="2016"/>
-            <w:shd w:val="clear" w:color="auto" w:fill="1E293B"/>
-          </w:tcPr>
-          <w:p>
-            <w:pPr>
-              <w:spacing w:before="0" w:after="0"/>
-              <w:jc w:val="center"/>
-            </w:pPr>
-            <w:r/>
-            <w:r>
-              <w:rPr>
-                <w:b/>
-                <w:color w:val="FFFFFF"/>
-                <w:sz w:val="16"/>
-              </w:rPr>
-              <w:t>Value / Result</w:t>
-            </w:r>
-          </w:p>
-        </w:tc>
-        <w:tc>
-          <w:tcPr>
-            <w:tcW w:type="dxa" w:w="1512"/>
-            <w:shd w:val="clear" w:color="auto" w:fill="1E293B"/>
-          </w:tcPr>
-          <w:p>
-            <w:pPr>
-              <w:spacing w:before="0" w:after="0"/>
-              <w:jc w:val="center"/>
-            </w:pPr>
-            <w:r/>
-            <w:r>
-              <w:rPr>
-                <w:b/>
-                <w:color w:val="FFFFFF"/>
-                <w:sz w:val="16"/>
-              </w:rPr>
-              <w:t>Initials</w:t>
-            </w:r>
-          </w:p>
-        </w:tc>
-      </w:tr>
-      <w:tr>
-        <w:trPr>
-          <w:trHeight w:val="680" w:hRule="atLeast"/>
-        </w:trPr>
-        <w:tc>
-          <w:tcPr>
-            <w:tcW w:type="dxa" w:w="504"/>
-          </w:tcPr>
-          <w:p>
-            <w:pPr>
-              <w:spacing w:before="0" w:after="0"/>
-            </w:pPr>
-            <w:r/>
-            <w:r>
-              <w:rPr>
-                <w:color w:val="334155"/>
-                <w:sz w:val="16"/>
-              </w:rPr>
-              <w:t xml:space="preserve">1</w:t>
-            </w:r>
-          </w:p>
-        </w:tc>
-        <w:tc>
-          <w:tcPr>
-            <w:tcW w:type="dxa" w:w="2016"/>
-          </w:tcPr>
-          <w:p>
-            <w:pPr>
-              <w:spacing w:before="0" w:after="0"/>
-            </w:pPr>
-            <w:r/>
-            <w:r>
-              <w:rPr>
-                <w:color w:val="334155"/>
-                <w:sz w:val="16"/>
-              </w:rPr>
-              <w:t xml:space="preserve">Measure pH</w:t>
-            </w:r>
-          </w:p>
-        </w:tc>
-        <w:tc>
-          <w:tcPr>
-            <w:tcW w:type="dxa" w:w="4032"/>
-          </w:tcPr>
-          <w:p>
-            <w:pPr>
-              <w:spacing w:before="0" w:after="80"/>
-            </w:pPr>
-            <w:r/>
-            <w:r>
-              <w:rPr>
-                <w:color w:val="334155"/>
-                <w:sz w:val="16"/>
-              </w:rPr>
-              <w:t xml:space="preserve">Measure and adjust pH. Target pH: 7.4.</w:t>
-            </w:r>
-          </w:p>
-          <w:p>
-            <w:pPr>
-              <w:spacing w:before="40" w:after="0"/>
-            </w:pPr>
-            <w:r>
-              <w:rPr>
-                <w:i/>
-                <w:color w:val="969BA5"/>
-                <w:sz w:val="14"/>
-              </w:rPr>
-              <w:t xml:space="preserve">Notes: </w:t>
-            </w:r>
-            <w:r>
-              <w:rPr>
-                <w:color w:val="334155"/>
-                <w:sz w:val="14"/>
-              </w:rPr>
-              <w:t xml:space="preserve"/>
-            </w:r>
-          </w:p>
-        </w:tc>
-        <w:tc>
-          <w:tcPr>
-            <w:tcW w:type="dxa" w:w="2016"/>
-          </w:tcPr>
-          <w:p>
-            <w:pPr>
-              <w:spacing w:before="0" w:after="0"/>
-            </w:pPr>
-            <w:r/>
-            <w:r>
-              <w:rPr>
-                <w:color w:val="334155"/>
-                <w:sz w:val="16"/>
-              </w:rPr>
-              <w:t xml:space="preserve"/>
-            </w:r>
-            <w:r>
-              <w:t xml:space="preserve"/>
-            </w:r>
-          </w:p>
-        </w:tc>
-        <w:tc>
-          <w:tcPr>
-            <w:tcW w:type="dxa" w:w="1512"/>
-          </w:tcPr>
-          <w:p>
-            <w:pPr>
-              <w:spacing w:before="0" w:after="0"/>
-            </w:pPr>
-            <w:r/>
-            <w:r>
-              <w:rPr>
-                <w:color w:val="334155"/>
-                <w:sz w:val="16"/>
-              </w:rPr>
-              <w:t xml:space="preserve"/>
-            </w:r>
-          </w:p>
-        </w:tc>
-      </w:tr>
-    </w:tbl>
-    <w:p>
-      <w:pPr>
-        <w:spacing w:after="0" w:before="0"/>
-      </w:pPr>
-      <w:r>
-        <w:rPr>
-          <w:color w:val="334155"/>
-          <w:sz w:val="2"/>
+          <w:b w:val="0"/>
+          <w:sz w:val="22"/>
         </w:rPr>
         <w:t xml:space="preserve"/>
       </w:r>
@@ -743,102 +450,6 @@
       </w:r>
     </w:p>
     <w:p>
-      <w:pPr>
-        <w:spacing w:after="0" w:before="0"/>
-      </w:pPr>
-      <w:r>
-        <w:t xml:space="preserve"/>
-      </w:r>
-      <w:r>
-        <w:t xml:space="preserve"/>
-      </w:r>
-    </w:p>
-    <w:p>
-      <w:pPr>
-        <w:spacing w:after="160" w:before="0"/>
-      </w:pPr>
-      <w:r>
-        <w:rPr>
-          <w:b/>
-          <w:color w:val="0F172A"/>
-          <w:sz w:val="22"/>
-        </w:rPr>
-        <w:t>Role Sign-Off</w:t>
-      </w:r>
-    </w:p>
-    <w:p>
-      <w:pPr>
-        <w:spacing w:after="240" w:before="0"/>
-      </w:pPr>
-      <w:r>
-        <w:rPr>
-          <w:b/>
-          <w:color w:val="334155"/>
-          <w:sz w:val="18"/>
-        </w:rPr>
-        <w:t xml:space="preserve"/>
-      </w:r>
-      <w:r>
-        <w:rPr>
-          <w:sz w:val="177800"/>
-          <w:szCs w:val="177800"/>
-          <w:b/>
-        </w:rPr>
-        <w:t xml:space="preserve">Media Prep</w:t>
-      </w:r>
-      <w:r>
-        <w:t xml:space="preserve"/>
-      </w:r>
-    </w:p>
-    <w:p>
-      <w:pPr>
-        <w:spacing w:after="40"/>
-      </w:pPr>
-      <w:r>
-        <w:rPr>
-          <w:color w:val="787878"/>
-          <w:sz w:val="18"/>
-        </w:rPr>
-        <w:t>____________________________</w:t>
-      </w:r>
-    </w:p>
-    <w:p>
-      <w:pPr>
-        <w:spacing w:after="240"/>
-      </w:pPr>
-      <w:r>
-        <w:rPr>
-          <w:color w:val="787878"/>
-          <w:sz w:val="14"/>
-        </w:rPr>
-        <w:t>Signature / Date</w:t>
-      </w:r>
-    </w:p>
-    <w:p>
-      <w:pPr>
-        <w:spacing w:after="240" w:before="0"/>
-      </w:pPr>
-      <w:r>
-        <w:rPr>
-          <w:b/>
-          <w:color w:val="334155"/>
-          <w:sz w:val="18"/>
-        </w:rPr>
-        <w:t xml:space="preserve"/>
-      </w:r>
-      <w:r>
-        <w:t xml:space="preserve"/>
-      </w:r>
-    </w:p>
-    <w:p>
-      <w:r>
-        <w:br w:type="page"/>
-      </w:r>
-    </w:p>
-    <w:p>
-      <w:pPr>
-        <w:spacing w:after="240" w:before="0"/>
-      </w:pPr>
       <w:r>
         <w:t xml:space="preserve"/>
       </w:r>
@@ -854,40 +465,233 @@
         <w:t xml:space="preserve"/>
       </w:r>
     </w:p>
+    <w:tbl>
+      <w:tblPr>
+        <w:tblStyle w:val="LightGrid-Accent1"/>
+        <w:tblW w:type="auto" w:w="0"/>
+        <w:tblLook w:firstColumn="1" w:firstRow="1" w:lastColumn="0" w:lastRow="0" w:noHBand="0" w:noVBand="1" w:val="04A0"/>
+      </w:tblPr>
+      <w:tblGrid>
+        <w:gridCol w:w="1108"/>
+        <w:gridCol w:w="1108"/>
+        <w:gridCol w:w="1108"/>
+        <w:gridCol w:w="1108"/>
+        <w:gridCol w:w="1108"/>
+        <w:gridCol w:w="1108"/>
+        <w:gridCol w:w="1108"/>
+        <w:gridCol w:w="1108"/>
+        <w:gridCol w:w="1108"/>
+      </w:tblGrid>
+      <w:tr>
+        <w:tc>
+          <w:tcPr>
+            <w:tcW w:type="dxa" w:w="1108"/>
+          </w:tcPr>
+          <w:p>
+            <w:r>
+              <w:t>Step</w:t>
+            </w:r>
+          </w:p>
+        </w:tc>
+        <w:tc>
+          <w:tcPr>
+            <w:tcW w:type="dxa" w:w="1108"/>
+          </w:tcPr>
+          <w:p>
+            <w:r>
+              <w:t>Description</w:t>
+            </w:r>
+          </w:p>
+        </w:tc>
+        <w:tc>
+          <w:tcPr>
+            <w:tcW w:type="dxa" w:w="1108"/>
+          </w:tcPr>
+          <w:p>
+            <w:r>
+              <w:t>Value</w:t>
+            </w:r>
+          </w:p>
+        </w:tc>
+        <w:tc>
+          <w:tcPr>
+            <w:tcW w:type="dxa" w:w="1108"/>
+          </w:tcPr>
+          <w:p>
+            <w:r>
+              <w:t>Operator</w:t>
+            </w:r>
+          </w:p>
+        </w:tc>
+        <w:tc>
+          <w:tcPr>
+            <w:tcW w:type="dxa" w:w="1108"/>
+          </w:tcPr>
+          <w:p>
+            <w:r>
+              <w:t>Reviewer</w:t>
+            </w:r>
+          </w:p>
+        </w:tc>
+        <w:tc>
+          <w:tcPr>
+            <w:tcW w:type="dxa" w:w="1108"/>
+          </w:tcPr>
+          <w:p>
+            <w:r>
+              <w:t>Scheduled</w:t>
+            </w:r>
+          </w:p>
+        </w:tc>
+        <w:tc>
+          <w:tcPr>
+            <w:tcW w:type="dxa" w:w="1108"/>
+          </w:tcPr>
+          <w:p>
+            <w:r>
+              <w:t>Actual Start</w:t>
+            </w:r>
+          </w:p>
+        </w:tc>
+        <w:tc>
+          <w:tcPr>
+            <w:tcW w:type="dxa" w:w="1108"/>
+          </w:tcPr>
+          <w:p>
+            <w:r>
+              <w:t>Actual End</w:t>
+            </w:r>
+          </w:p>
+        </w:tc>
+        <w:tc>
+          <w:tcPr>
+            <w:tcW w:type="dxa" w:w="1108"/>
+          </w:tcPr>
+          <w:p>
+            <w:r>
+              <w:t>Notes</w:t>
+            </w:r>
+          </w:p>
+        </w:tc>
+      </w:tr>
+      <w:tr>
+        <w:tc>
+          <w:tcPr>
+            <w:tcW w:type="dxa" w:w="1108"/>
+          </w:tcPr>
+          <w:p>
+            <w:r>
+              <w:t xml:space="preserve">Measure pH</w:t>
+            </w:r>
+          </w:p>
+        </w:tc>
+        <w:tc>
+          <w:tcPr>
+            <w:tcW w:type="dxa" w:w="1108"/>
+          </w:tcPr>
+          <w:p>
+            <w:r>
+              <w:t xml:space="preserve">Measure and adjust pH. Target pH: 7.4.</w:t>
+            </w:r>
+          </w:p>
+        </w:tc>
+        <w:tc>
+          <w:tcPr>
+            <w:tcW w:type="dxa" w:w="1108"/>
+          </w:tcPr>
+          <w:p>
+            <w:r>
+              <w:t xml:space="preserve"/>
+            </w:r>
+            <w:r>
+              <w:t xml:space="preserve"/>
+            </w:r>
+          </w:p>
+        </w:tc>
+        <w:tc>
+          <w:tcPr>
+            <w:tcW w:type="dxa" w:w="1108"/>
+          </w:tcPr>
+          <w:p>
+            <w:r>
+              <w:t xml:space="preserve"/>
+            </w:r>
+          </w:p>
+        </w:tc>
+        <w:tc>
+          <w:tcPr>
+            <w:tcW w:type="dxa" w:w="1108"/>
+          </w:tcPr>
+          <w:p>
+            <w:r>
+              <w:t xml:space="preserve"/>
+            </w:r>
+          </w:p>
+        </w:tc>
+        <w:tc>
+          <w:tcPr>
+            <w:tcW w:type="dxa" w:w="1108"/>
+          </w:tcPr>
+          <w:p>
+            <w:r>
+              <w:t xml:space="preserve"/>
+            </w:r>
+          </w:p>
+        </w:tc>
+        <w:tc>
+          <w:tcPr>
+            <w:tcW w:type="dxa" w:w="1108"/>
+          </w:tcPr>
+          <w:p>
+            <w:r>
+              <w:t xml:space="preserve"/>
+            </w:r>
+          </w:p>
+        </w:tc>
+        <w:tc>
+          <w:tcPr>
+            <w:tcW w:type="dxa" w:w="1108"/>
+          </w:tcPr>
+          <w:p>
+            <w:r>
+              <w:t xml:space="preserve"/>
+            </w:r>
+          </w:p>
+        </w:tc>
+        <w:tc>
+          <w:tcPr>
+            <w:tcW w:type="dxa" w:w="1108"/>
+          </w:tcPr>
+          <w:p>
+            <w:r>
+              <w:t xml:space="preserve"/>
+            </w:r>
+          </w:p>
+        </w:tc>
+      </w:tr>
+    </w:tbl>
     <w:p>
-      <w:pPr>
-        <w:spacing w:after="40"/>
-      </w:pPr>
       <w:r>
         <w:rPr>
-          <w:color w:val="787878"/>
-          <w:sz w:val="18"/>
+          <w:b/>
+          <w:sz w:val="28"/>
         </w:rPr>
-        <w:t>____________________________</w:t>
-      </w:r>
-    </w:p>
-    <w:p>
-      <w:pPr>
-        <w:spacing w:after="240"/>
-      </w:pPr>
-      <w:r>
-        <w:rPr>
-          <w:color w:val="787878"/>
-          <w:sz w:val="14"/>
-        </w:rPr>
-        <w:t>Signature / Date</w:t>
+        <w:t>Approval</w:t>
       </w:r>
     </w:p>
     <w:p>
       <w:r>
-        <w:t/>
+        <w:rPr>
+          <w:b w:val="0"/>
+          <w:sz w:val="22"/>
+        </w:rPr>
+        <w:t xml:space="preserve"/>
       </w:r>
     </w:p>
     <w:sectPr>
       <w:headerReference w:type="default" r:id="rId9"/>
-      <w:footerReference w:type="default" r:id="rId10"/>
       <w:pgSz w:w="12240" w:h="15840"/>
-      <w:pgMar w:top="1440" w:right="1080" w:bottom="1440" w:left="1080" w:header="720" w:footer="720" w:gutter="0"/>
+      <w:pgMar w:top="1134" w:right="1134" w:bottom="1134" w:left="1134" w:header="720" w:footer="720" w:gutter="0"/>
       <w:cols w:space="720"/>
       <w:docGrid w:linePitch="360"/>
     </w:sectPr>
@@ -895,63 +699,14 @@
 </w:document>
 </file>
 
-<file path=word/footer1.xml><?xml version="1.0" encoding="utf-8"?>
-<w:ftr xmlns:m="http://schemas.openxmlformats.org/officeDocument/2006/math" xmlns:mc="http://schemas.openxmlformats.org/markup-compatibility/2006" xmlns:mo="http://schemas.microsoft.com/office/mac/office/2008/main" xmlns:mv="urn:schemas-microsoft-com:mac:vml" xmlns:o="urn:schemas-microsoft-com:office:office" xmlns:r="http://schemas.openxmlformats.org/officeDocument/2006/relationships" xmlns:v="urn:schemas-microsoft-com:vml" xmlns:w10="urn:schemas-microsoft-com:office:word" xmlns:w14="http://schemas.microsoft.com/office/word/2010/wordml" xmlns:w="http://schemas.openxmlformats.org/wordprocessingml/2006/main" xmlns:wne="http://schemas.microsoft.com/office/word/2006/wordml" xmlns:wp14="http://schemas.microsoft.com/office/word/2010/wordprocessingDrawing" xmlns:wp="http://schemas.openxmlformats.org/drawingml/2006/wordprocessingDrawing" xmlns:wpc="http://schemas.microsoft.com/office/word/2010/wordprocessingCanvas" xmlns:wpg="http://schemas.microsoft.com/office/word/2010/wordprocessingGroup" xmlns:wpi="http://schemas.microsoft.com/office/word/2010/wordprocessingInk" xmlns:wps="http://schemas.microsoft.com/office/word/2010/wordprocessingShape" mc:Ignorable="w14 wp14">
-  <w:p>
-    <w:pPr>
-      <w:pStyle w:val="Footer"/>
-      <w:jc w:val="center"/>
-    </w:pPr>
-    <w:r>
-      <w:rPr>
-        <w:color w:val="969696"/>
-        <w:sz w:val="16"/>
-      </w:rPr>
-      <w:t xml:space="preserve">Page </w:t>
-      <w:fldChar w:fldCharType="begin"/>
-      <w:instrText> PAGE </w:instrText>
-      <w:fldChar w:fldCharType="end"/>
-    </w:r>
-    <w:r>
-      <w:rPr>
-        <w:color w:val="969696"/>
-        <w:sz w:val="16"/>
-      </w:rPr>
-      <w:t xml:space="preserve"> / </w:t>
-      <w:fldChar w:fldCharType="begin"/>
-      <w:instrText> NUMPAGES </w:instrText>
-      <w:fldChar w:fldCharType="end"/>
-    </w:r>
-  </w:p>
-</w:ftr>
-</file>
-
 <file path=word/header1.xml><?xml version="1.0" encoding="utf-8"?>
 <w:hdr xmlns:m="http://schemas.openxmlformats.org/officeDocument/2006/math" xmlns:mc="http://schemas.openxmlformats.org/markup-compatibility/2006" xmlns:mo="http://schemas.microsoft.com/office/mac/office/2008/main" xmlns:mv="urn:schemas-microsoft-com:mac:vml" xmlns:o="urn:schemas-microsoft-com:office:office" xmlns:r="http://schemas.openxmlformats.org/officeDocument/2006/relationships" xmlns:v="urn:schemas-microsoft-com:vml" xmlns:w10="urn:schemas-microsoft-com:office:word" xmlns:w14="http://schemas.microsoft.com/office/word/2010/wordml" xmlns:w="http://schemas.openxmlformats.org/wordprocessingml/2006/main" xmlns:wne="http://schemas.microsoft.com/office/word/2006/wordml" xmlns:wp14="http://schemas.microsoft.com/office/word/2010/wordprocessingDrawing" xmlns:wp="http://schemas.openxmlformats.org/drawingml/2006/wordprocessingDrawing" xmlns:wpc="http://schemas.microsoft.com/office/word/2010/wordprocessingCanvas" xmlns:wpg="http://schemas.microsoft.com/office/word/2010/wordprocessingGroup" xmlns:wpi="http://schemas.microsoft.com/office/word/2010/wordprocessingInk" xmlns:wps="http://schemas.microsoft.com/office/word/2010/wordprocessingShape" mc:Ignorable="w14 wp14">
   <w:p>
     <w:pPr>
       <w:pStyle w:val="Header"/>
-      <w:tabs>
-        <w:tab w:pos="10080" w:val="right"/>
-      </w:tabs>
-      <w:jc w:val="left"/>
     </w:pPr>
     <w:r>
-      <w:rPr>
-        <w:i/>
-        <w:color w:val="787878"/>
-        <w:sz w:val="18"/>
-      </w:rPr>
-      <w:t xml:space="preserve">BATCH RECORD: Multi-Role Buffer Protocol</w:t>
-      <w:tab/>
-    </w:r>
-    <w:r>
-      <w:rPr>
-        <w:i/>
-        <w:color w:val="787878"/>
-        <w:sz w:val="18"/>
-      </w:rPr>
-      <w:t xml:space="preserve">v2  |  April 1, 2026</w:t>
+      <w:t xml:space="preserve">        Run: Preview    </w:t>
     </w:r>
   </w:p>
 </w:hdr>

</xml_diff>

<commit_message>
fix(F-0086): surface errors from lot auto-generate and save handlers
QA-verify caught that lotAutoGenerate and lotSave silently swallowed
network/API failures. Wrap both in try/catch and propagate to the
page-level error state, matching how startRun/completeRun/saveEdits
already report errors.

Also includes regenerated template render artifacts that reflect the
F-0086 batch_record_default.docx changes (lot row now binds to
lot_number and is gated by produces_lot).

Co-Authored-By: Claude Opus 4.7 <noreply@anthropic.com>
</commit_message>
<xml_diff>
--- a/backend/tests/artifacts/templates/batch_record_blank_roles.docx
+++ b/backend/tests/artifacts/templates/batch_record_blank_roles.docx
@@ -156,59 +156,6 @@
                 <w:sz w:val="20"/>
               </w:rPr>
               <w:t xml:space="preserve">Multi-Role Buffer Protocol</w:t>
-            </w:r>
-          </w:p>
-        </w:tc>
-      </w:tr>
-      <w:tr>
-        <w:tc>
-          <w:tcPr>
-            <w:tcW w:type="dxa" w:w="3400"/>
-            <w:shd w:val="clear" w:color="auto" w:fill="F1F3F4"/>
-            <w:tcBorders>
-              <w:top w:val="single" w:sz="4" w:color="BFBFBF"/>
-              <w:left w:val="single" w:sz="4" w:color="BFBFBF"/>
-              <w:bottom w:val="single" w:sz="4" w:color="BFBFBF"/>
-              <w:right w:val="single" w:sz="4" w:color="BFBFBF"/>
-            </w:tcBorders>
-            <w:vAlign w:val="center"/>
-          </w:tcPr>
-          <w:p>
-            <w:r/>
-            <w:r>
-              <w:rPr>
-                <w:rFonts w:ascii="Arial" w:hAnsi="Arial" w:cs="Arial"/>
-                <w:b/>
-                <w:i w:val="0"/>
-                <w:color w:val="000000"/>
-                <w:sz w:val="20"/>
-              </w:rPr>
-              <w:t>Batch / Lot Number</w:t>
-            </w:r>
-          </w:p>
-        </w:tc>
-        <w:tc>
-          <w:tcPr>
-            <w:tcW w:type="dxa" w:w="6400"/>
-            <w:tcBorders>
-              <w:top w:val="single" w:sz="4" w:color="BFBFBF"/>
-              <w:left w:val="single" w:sz="4" w:color="BFBFBF"/>
-              <w:bottom w:val="single" w:sz="4" w:color="BFBFBF"/>
-              <w:right w:val="single" w:sz="4" w:color="BFBFBF"/>
-            </w:tcBorders>
-            <w:vAlign w:val="center"/>
-          </w:tcPr>
-          <w:p>
-            <w:r/>
-            <w:r>
-              <w:rPr>
-                <w:rFonts w:ascii="Arial" w:hAnsi="Arial" w:cs="Arial"/>
-                <w:b w:val="0"/>
-                <w:i w:val="0"/>
-                <w:color w:val="000000"/>
-                <w:sz w:val="20"/>
-              </w:rPr>
-              <w:t xml:space="preserve">Preview</w:t>
             </w:r>
           </w:p>
         </w:tc>

</xml_diff>